<commit_message>
Changed agents[i] to agents[0], agents[1], etc. Don't get the "i" undefined error, but now get an error "'str' object not available".
</commit_message>
<xml_diff>
--- a/docassemble/DeAhcd/data/templates/de_ahcd.docx
+++ b/docassemble/DeAhcd/data/templates/de_ahcd.docx
@@ -4452,7 +4452,23 @@
           <w:sz w:val="24"/>
           <w:szCs w:val="24"/>
         </w:rPr>
-        <w:t>antomicalgifts</w:t>
+        <w:t>an</w:t>
+      </w:r>
+      <w:r>
+        <w:rPr>
+          <w:rFonts w:ascii="Times New Roman" w:hAnsi="Times New Roman" w:cs="Times New Roman"/>
+          <w:sz w:val="24"/>
+          <w:szCs w:val="24"/>
+        </w:rPr>
+        <w:t>a</w:t>
+      </w:r>
+      <w:r>
+        <w:rPr>
+          <w:rFonts w:ascii="Times New Roman" w:hAnsi="Times New Roman" w:cs="Times New Roman"/>
+          <w:sz w:val="24"/>
+          <w:szCs w:val="24"/>
+        </w:rPr>
+        <w:t>tomicalgifts</w:t>
       </w:r>
       <w:r>
         <w:rPr>
@@ -18410,10 +18426,6 @@
 </file>
 
 <file path=customXml/item1.xml><?xml version="1.0" encoding="utf-8"?>
-<b:Sources xmlns:b="http://schemas.openxmlformats.org/officeDocument/2006/bibliography" xmlns="http://schemas.openxmlformats.org/officeDocument/2006/bibliography" SelectedStyle="/APA.XSL" StyleName="APA"/>
-</file>
-
-<file path=customXml/item2.xml><?xml version="1.0" encoding="utf-8"?>
 <ct:contentTypeSchema xmlns:ct="http://schemas.microsoft.com/office/2006/metadata/contentType" xmlns:ma="http://schemas.microsoft.com/office/2006/metadata/properties/metaAttributes" ct:_="" ma:_="" ma:contentTypeName="Document" ma:contentTypeID="0x010100283A6E5CEEE05D4B872D1FE4CA32851F" ma:contentTypeVersion="14" ma:contentTypeDescription="Create a new document." ma:contentTypeScope="" ma:versionID="7d6ff85d8663bbfdd655c3af86711b9d">
   <xsd:schema xmlns:xsd="http://www.w3.org/2001/XMLSchema" xmlns:xs="http://www.w3.org/2001/XMLSchema" xmlns:p="http://schemas.microsoft.com/office/2006/metadata/properties" xmlns:ns2="579ca1c8-23cd-45df-ac06-39d80f9578b0" xmlns:ns3="52a8d3df-7a0c-4a3e-8f2a-be7a910a0cce" targetNamespace="http://schemas.microsoft.com/office/2006/metadata/properties" ma:root="true" ma:fieldsID="cfd85902a2f9b15eb5ff51fea07611fa" ns2:_="" ns3:_="">
     <xsd:import namespace="579ca1c8-23cd-45df-ac06-39d80f9578b0"/>
@@ -18614,16 +18626,11 @@
 </ct:contentTypeSchema>
 </file>
 
-<file path=customXml/item3.xml><?xml version="1.0" encoding="utf-8"?>
-<?mso-contentType ?>
-<FormTemplates xmlns="http://schemas.microsoft.com/sharepoint/v3/contenttype/forms">
-  <Display>DocumentLibraryForm</Display>
-  <Edit>DocumentLibraryForm</Edit>
-  <New>DocumentLibraryForm</New>
-</FormTemplates>
+<file path=customXml/item2.xml><?xml version="1.0" encoding="utf-8"?>
+<b:Sources xmlns:b="http://schemas.openxmlformats.org/officeDocument/2006/bibliography" xmlns="http://schemas.openxmlformats.org/officeDocument/2006/bibliography" SelectedStyle="/APA.XSL" StyleName="APA"/>
 </file>
 
-<file path=customXml/item4.xml><?xml version="1.0" encoding="utf-8"?>
+<file path=customXml/item3.xml><?xml version="1.0" encoding="utf-8"?>
 <p:properties xmlns:p="http://schemas.microsoft.com/office/2006/metadata/properties" xmlns:xsi="http://www.w3.org/2001/XMLSchema-instance" xmlns:pc="http://schemas.microsoft.com/office/infopath/2007/PartnerControls">
   <documentManagement>
     <lcf76f155ced4ddcb4097134ff3c332f xmlns="579ca1c8-23cd-45df-ac06-39d80f9578b0">
@@ -18634,15 +18641,16 @@
 </p:properties>
 </file>
 
-<file path=customXml/itemProps1.xml><?xml version="1.0" encoding="utf-8"?>
-<ds:datastoreItem xmlns:ds="http://schemas.openxmlformats.org/officeDocument/2006/customXml" ds:itemID="{EF278816-EC6F-A645-907D-7F25AECB1D4A}">
-  <ds:schemaRefs>
-    <ds:schemaRef ds:uri="http://schemas.openxmlformats.org/officeDocument/2006/bibliography"/>
-  </ds:schemaRefs>
-</ds:datastoreItem>
+<file path=customXml/item4.xml><?xml version="1.0" encoding="utf-8"?>
+<?mso-contentType ?>
+<FormTemplates xmlns="http://schemas.microsoft.com/sharepoint/v3/contenttype/forms">
+  <Display>DocumentLibraryForm</Display>
+  <Edit>DocumentLibraryForm</Edit>
+  <New>DocumentLibraryForm</New>
+</FormTemplates>
 </file>
 
-<file path=customXml/itemProps2.xml><?xml version="1.0" encoding="utf-8"?>
+<file path=customXml/itemProps1.xml><?xml version="1.0" encoding="utf-8"?>
 <ds:datastoreItem xmlns:ds="http://schemas.openxmlformats.org/officeDocument/2006/customXml" ds:itemID="{C31DF968-C855-428B-AFB0-641839B919BD}">
   <ds:schemaRefs>
     <ds:schemaRef ds:uri="http://schemas.microsoft.com/office/2006/metadata/contentType"/>
@@ -18661,15 +18669,15 @@
 </ds:datastoreItem>
 </file>
 
-<file path=customXml/itemProps3.xml><?xml version="1.0" encoding="utf-8"?>
-<ds:datastoreItem xmlns:ds="http://schemas.openxmlformats.org/officeDocument/2006/customXml" ds:itemID="{3B0B2B05-1CFC-4741-BAD7-15F8E53C5224}">
+<file path=customXml/itemProps2.xml><?xml version="1.0" encoding="utf-8"?>
+<ds:datastoreItem xmlns:ds="http://schemas.openxmlformats.org/officeDocument/2006/customXml" ds:itemID="{EF278816-EC6F-A645-907D-7F25AECB1D4A}">
   <ds:schemaRefs>
-    <ds:schemaRef ds:uri="http://schemas.microsoft.com/sharepoint/v3/contenttype/forms"/>
+    <ds:schemaRef ds:uri="http://schemas.openxmlformats.org/officeDocument/2006/bibliography"/>
   </ds:schemaRefs>
 </ds:datastoreItem>
 </file>
 
-<file path=customXml/itemProps4.xml><?xml version="1.0" encoding="utf-8"?>
+<file path=customXml/itemProps3.xml><?xml version="1.0" encoding="utf-8"?>
 <ds:datastoreItem xmlns:ds="http://schemas.openxmlformats.org/officeDocument/2006/customXml" ds:itemID="{49734BA3-787E-4A93-BDC5-EE95D861F75B}">
   <ds:schemaRefs>
     <ds:schemaRef ds:uri="http://schemas.microsoft.com/office/2006/metadata/properties"/>
@@ -18678,4 +18686,12 @@
     <ds:schemaRef ds:uri="52a8d3df-7a0c-4a3e-8f2a-be7a910a0cce"/>
   </ds:schemaRefs>
 </ds:datastoreItem>
+</file>
+
+<file path=customXml/itemProps4.xml><?xml version="1.0" encoding="utf-8"?>
+<ds:datastoreItem xmlns:ds="http://schemas.openxmlformats.org/officeDocument/2006/customXml" ds:itemID="{3B0B2B05-1CFC-4741-BAD7-15F8E53C5224}">
+  <ds:schemaRefs>
+    <ds:schemaRef ds:uri="http://schemas.microsoft.com/sharepoint/v3/contenttype/forms"/>
+  </ds:schemaRefs>
+</ds:datastoreItem>
 </file>
</xml_diff>